<commit_message>
Fix PR-REPAY-01 income-recognition error in the Design Doc
CB-REPAY's design note and the Design Doc's Appendix B Posting-Rule
Catalog described PR-REPAY-01 as crediting FeeIncome + InterestIncome on
collection. That double-recognizes income already booked once at accrual
(PR-ACCR-01) or assessment (PR-DELINQ-01) time. Corrected to: Dr Cash/Nostro
/ Cr FeeReceivable + InterestReceivable + LoanReceivable, clearing the
receivables built up earlier rather than re-crediting Income.

PR-PAYOFF-01's entry was already correct and required no change. This is a
documentation-only fix: the actual OpenAPI specs (specs/openapi/gl-posting-engine.yaml)
never encoded specific GL account names for these rules — account selection
was always GL-internal, abstracted behind the categorized Allocation schema
— so no spec file was affected, only the Design Doc's prose description.

Co-Authored-By: Claude Sonnet 5 <noreply@anthropic.com>
Claude-Session: https://claude.ai/code/session_01LnZ5Bq8mXgxaddT2uRQKmQ
</commit_message>
<xml_diff>
--- a/Loan_Ledger_Design_Doc.docx
+++ b/Loan_Ledger_Design_Doc.docx
@@ -2904,7 +2904,7 @@
           <w:rFonts w:ascii="Georgia" w:hAnsi="Georgia"/>
           <w:sz w:val="19"/>
         </w:rPr>
-        <w:t xml:space="preserve"> (Dr Cash/Nostro P / Cr FeeIncome + InterestIncome + LoanReceivable per allocation), idempotent on paymentReferenceId — REQ-REPAY-003, 004.</w:t>
+        <w:t xml:space="preserve"> (Dr Cash/Nostro P / Cr FeeReceivable + InterestReceivable + LoanReceivable per allocation — clearing receivables already recognized at accrual/assessment time, never re-crediting Income), idempotent on paymentReferenceId — REQ-REPAY-003, 004.</w:t>
       </w:r>
     </w:p>
     <w:p>
@@ -3065,7 +3065,7 @@
               <w:rPr>
                 <w:sz w:val="17"/>
               </w:rPr>
-              <w:t>Dr Cash/Nostro P / Cr FeeIncome + InterestIncome + LoanReceivable (per allocation)</w:t>
+              <w:t>Dr Cash/Nostro P / Cr FeeReceivable + InterestReceivable + LoanReceivable (per allocation)</w:t>
             </w:r>
           </w:p>
         </w:tc>
@@ -3078,7 +3078,7 @@
               <w:rPr>
                 <w:sz w:val="17"/>
               </w:rPr>
-              <w:t>matched, waterfall-allocated repayment</w:t>
+              <w:t>matched, waterfall-allocated repayment — clears receivables built up by PR-ACCR-01/PR-DELINQ-01, never re-credits Income</w:t>
             </w:r>
           </w:p>
         </w:tc>
@@ -3640,6 +3640,14 @@
       </w:pPr>
       <w:r>
         <w:t>Unmatched-payment queue needs its own alerting SLA, not just EOD visibility.</w:t>
+      </w:r>
+    </w:p>
+    <w:p>
+      <w:pPr>
+        <w:pStyle w:val="ListBullet"/>
+      </w:pPr>
+      <w:r>
+        <w:t>Income-recognition principle: PR-REPAY-01 clears Cash against Fee/Interest/Loan Receivable — it never credits Fee/Interest Income directly, since that income was already recognized once at accrual (PR-ACCR-01) or assessment (PR-DELINQ-01) time. Crediting Income again here would double-count it.</w:t>
       </w:r>
     </w:p>
     <w:p>
@@ -7317,7 +7325,7 @@
               <w:rPr>
                 <w:sz w:val="17"/>
               </w:rPr>
-              <w:t>Dr Cash/Nostro P / Cr FeeIncome + InterestIncome + LoanReceivable (per allocation)</w:t>
+              <w:t>Dr Cash/Nostro P / Cr FeeReceivable + InterestReceivable + LoanReceivable (per allocation)</w:t>
             </w:r>
           </w:p>
         </w:tc>
@@ -7330,7 +7338,7 @@
               <w:rPr>
                 <w:sz w:val="17"/>
               </w:rPr>
-              <w:t>matched, waterfall-allocated repayment</w:t>
+              <w:t>matched, waterfall-allocated repayment — clears receivables built up by PR-ACCR-01/PR-DELINQ-01, never re-credits Income</w:t>
             </w:r>
           </w:p>
         </w:tc>

</xml_diff>